<commit_message>
docs(paper): update author list to Adhyan Jain (1st), Shubhi Singh (2nd), Prof. Bhuvaneswari M
</commit_message>
<xml_diff>
--- a/METIS_X_Final_Paper_Template2.docx
+++ b/METIS_X_Final_Paper_Template2.docx
@@ -45,7 +45,7 @@
           <w:i w:val="0"/>
           <w:sz w:val="22"/>
         </w:rPr>
-        <w:t>Adhyan Jain¹, Shubhi Singh¹, Akshith Venkataramana¹, Arjuman¹, Prof. Bhuvaneswari M¹</w:t>
+        <w:t>Adhyan Jain¹, Shubhi Singh¹, Prof. Bhuvaneswari M¹</w:t>
       </w:r>
     </w:p>
     <w:p>
@@ -7098,7 +7098,7 @@
           <w:i w:val="0"/>
           <w:sz w:val="24"/>
         </w:rPr>
-        <w:t>Adhyan Jain conceived the METIS-X architecture, implemented the C++ template headers, physical allocator profiler, and benchmark drivers. Shubhi Singh performed the 26-corpus event trace extraction, statistical analysis, and baseline reconciliation. Akshith Venkataramana and Arjuman assisted in differential fuzz testing and figure generation. Prof. Bhuvaneswari M supervised the research, validated the experimental methodology, and reviewed the manuscript.</w:t>
+        <w:t>Adhyan Jain conceived the METIS-X architecture, implemented the C++ template headers, physical allocator profiler, and benchmark drivers. Shubhi Singh performed the 26-corpus event trace extraction, statistical analysis, baseline reconciliation, and figure generation. Prof. Bhuvaneswari M supervised the research, validated the experimental methodology, and reviewed the manuscript.</w:t>
       </w:r>
     </w:p>
     <w:p>

</xml_diff>